<commit_message>
docs: isi identitas mahasiswa pada dokumen jawaban Tugas05
</commit_message>
<xml_diff>
--- a/Tugas/Tugas05/Jawaban_Latihan_Black_Box_Testing_Materi_5.docx
+++ b/Tugas/Tugas05/Jawaban_Latihan_Black_Box_Testing_Materi_5.docx
@@ -83,7 +83,7 @@
                 <w:b/>
                 <w:sz w:val="18"/>
               </w:rPr>
-              <w:t>Diisi oleh mahasiswa</w:t>
+              <w:t>Mata Kuliah: Implementasi Pengujian Perangkat Lunak — Pertemuan 5</w:t>
             </w:r>
           </w:p>
         </w:tc>
@@ -125,7 +125,7 @@
                 <w:b w:val="0"/>
                 <w:sz w:val="18"/>
               </w:rPr>
-              <w:t>................................................................</w:t>
+              <w:t>Lutfiana Faisal Patah</w:t>
             </w:r>
           </w:p>
         </w:tc>
@@ -167,7 +167,7 @@
                 <w:b w:val="0"/>
                 <w:sz w:val="18"/>
               </w:rPr>
-              <w:t>................................................................</w:t>
+              <w:t>3224018</w:t>
             </w:r>
           </w:p>
         </w:tc>
@@ -209,7 +209,7 @@
                 <w:b w:val="0"/>
                 <w:sz w:val="18"/>
               </w:rPr>
-              <w:t>................................................................</w:t>
+              <w:t>Sistem Informasi</w:t>
             </w:r>
           </w:p>
         </w:tc>

</xml_diff>